<commit_message>
enhance bonafide form formatting and document generation
</commit_message>
<xml_diff>
--- a/templates/Bonafide_Certificate.docx
+++ b/templates/Bonafide_Certificate.docx
@@ -21,52 +21,6 @@
           <w:sz w:val="24"/>
           <w:szCs w:val="24"/>
         </w:rPr>
-        <w:drawing>
-          <wp:anchor behindDoc="0" distT="114300" distB="114300" distL="114300" distR="114300" simplePos="0" locked="0" layoutInCell="0" allowOverlap="1" relativeHeight="2">
-            <wp:simplePos x="0" y="0"/>
-            <wp:positionH relativeFrom="column">
-              <wp:posOffset>0</wp:posOffset>
-            </wp:positionH>
-            <wp:positionV relativeFrom="paragraph">
-              <wp:posOffset>114300</wp:posOffset>
-            </wp:positionV>
-            <wp:extent cx="795020" cy="667385"/>
-            <wp:effectExtent l="0" t="0" r="0" b="0"/>
-            <wp:wrapSquare wrapText="bothSides"/>
-            <wp:docPr id="1" name="image1.png"/>
-            <wp:cNvGraphicFramePr>
-              <a:graphicFrameLocks xmlns:a="http://schemas.openxmlformats.org/drawingml/2006/main" noChangeAspect="1"/>
-            </wp:cNvGraphicFramePr>
-            <a:graphic xmlns:a="http://schemas.openxmlformats.org/drawingml/2006/main">
-              <a:graphicData uri="http://schemas.openxmlformats.org/drawingml/2006/picture">
-                <pic:pic xmlns:pic="http://schemas.openxmlformats.org/drawingml/2006/picture">
-                  <pic:nvPicPr>
-                    <pic:cNvPr id="1" name="image1.png"/>
-                    <pic:cNvPicPr>
-                      <a:picLocks noChangeAspect="1" noChangeArrowheads="1"/>
-                    </pic:cNvPicPr>
-                  </pic:nvPicPr>
-                  <pic:blipFill>
-                    <a:blip r:embed="rId2"/>
-                    <a:stretch>
-                      <a:fillRect/>
-                    </a:stretch>
-                  </pic:blipFill>
-                  <pic:spPr bwMode="auto">
-                    <a:xfrm>
-                      <a:off x="0" y="0"/>
-                      <a:ext cx="795020" cy="667385"/>
-                    </a:xfrm>
-                    <a:prstGeom prst="rect">
-                      <a:avLst/>
-                    </a:prstGeom>
-                    <a:noFill/>
-                  </pic:spPr>
-                </pic:pic>
-              </a:graphicData>
-            </a:graphic>
-          </wp:anchor>
-        </w:drawing>
       </w:r>
       <w:bookmarkStart w:id="0" w:name="_xxif6teewy03"/>
       <w:bookmarkStart w:id="1" w:name="_xxif6teewy03"/>
@@ -93,6 +47,7 @@
           <w:sz w:val="24"/>
           <w:szCs w:val="24"/>
         </w:rPr>
+        <w:tab/>
         <w:t>THIAGARAJAR COLLEGE OF ENGINEERING,MADURAI - 625015</w:t>
       </w:r>
     </w:p>
@@ -104,7 +59,7 @@
       </w:pPr>
       <w:r>
         <w:rPr/>
-        <w:t>(A Govt.Aided Autonomous Institution affiliated to Anna University)</w:t>
+        <w:t>(A Govt. Aided Autonomous Institution affiliated to Anna University)</w:t>
       </w:r>
     </w:p>
     <w:p>
@@ -115,14 +70,12 @@
           <w:szCs w:val="32"/>
         </w:rPr>
       </w:pPr>
-      <w:bookmarkStart w:id="3" w:name="_3opcs80etra"/>
-      <w:bookmarkEnd w:id="3"/>
       <w:r>
         <w:rPr>
           <w:sz w:val="32"/>
           <w:szCs w:val="32"/>
         </w:rPr>
-        <w:t>--------------------------------------------------------------------------</w:t>
+        <w:t>---------------------------------------------------------------------------------------</w:t>
       </w:r>
     </w:p>
     <w:p>
@@ -261,29 +214,32 @@
           <w:sz w:val="28"/>
           <w:szCs w:val="28"/>
         </w:rPr>
-        <w:t xml:space="preserve">Certified that {title} {name} , (Roll No:{rollno}) of {relation} </w:t>
-      </w:r>
-      <w:r>
-        <w:rPr>
-          <w:color w:val="202124"/>
-          <w:sz w:val="28"/>
-          <w:szCs w:val="28"/>
-          <w:highlight w:val="white"/>
-        </w:rPr>
-        <w:t>{parentName} is a bonafide student of this College studying in {year}</w:t>
-      </w:r>
-    </w:p>
-    <w:p>
-      <w:pPr>
-        <w:pStyle w:val="normal1"/>
-        <w:pageBreakBefore w:val="false"/>
+        <w:t xml:space="preserve">      </w:t>
+      </w:r>
+      <w:r>
+        <w:rPr>
+          <w:sz w:val="28"/>
+          <w:szCs w:val="28"/>
+        </w:rPr>
+        <w:t>Certified that {title}. {name},(Roll No : {rollno}) of {relation</w:t>
+      </w:r>
+      <w:r>
+        <w:rPr>
+          <w:sz w:val="28"/>
+          <w:szCs w:val="28"/>
+        </w:rPr>
+        <w:t>}</w:t>
+      </w:r>
+    </w:p>
+    <w:p>
+      <w:pPr>
+        <w:pStyle w:val="normal1"/>
         <w:shd w:val="clear" w:fill="auto"/>
         <w:spacing w:lineRule="auto" w:line="480"/>
         <w:ind w:hanging="0" w:start="720"/>
         <w:jc w:val="both"/>
         <w:rPr>
-          <w:b/>
-          <w:bCs/>
+          <w:color w:val="202124"/>
           <w:sz w:val="28"/>
           <w:szCs w:val="28"/>
           <w:highlight w:val="white"/>
@@ -296,17 +252,83 @@
           <w:szCs w:val="28"/>
           <w:highlight w:val="white"/>
         </w:rPr>
-        <w:t>Year, {course} - {branch} during the year {academicYear}</w:t>
-      </w:r>
-      <w:r>
-        <w:rPr>
-          <w:b/>
-          <w:bCs/>
+        <w:t xml:space="preserve">{parentName} is a bonafide student of this College studying in </w:t>
+      </w:r>
+    </w:p>
+    <w:p>
+      <w:pPr>
+        <w:pStyle w:val="normal1"/>
+        <w:shd w:val="clear" w:fill="auto"/>
+        <w:spacing w:lineRule="auto" w:line="480"/>
+        <w:ind w:hanging="0" w:start="720"/>
+        <w:jc w:val="both"/>
+        <w:rPr>
           <w:color w:val="202124"/>
           <w:sz w:val="28"/>
           <w:szCs w:val="28"/>
           <w:highlight w:val="white"/>
         </w:rPr>
+      </w:pPr>
+      <w:r>
+        <w:rPr>
+          <w:color w:val="202124"/>
+          <w:sz w:val="28"/>
+          <w:szCs w:val="28"/>
+          <w:highlight w:val="white"/>
+        </w:rPr>
+        <w:t>{year</w:t>
+      </w:r>
+      <w:r>
+        <w:rPr>
+          <w:color w:val="202124"/>
+          <w:sz w:val="28"/>
+          <w:szCs w:val="28"/>
+          <w:highlight w:val="white"/>
+        </w:rPr>
+        <w:t xml:space="preserve">} </w:t>
+      </w:r>
+      <w:r>
+        <w:rPr>
+          <w:color w:val="202124"/>
+          <w:sz w:val="28"/>
+          <w:szCs w:val="28"/>
+          <w:highlight w:val="white"/>
+        </w:rPr>
+        <w:t xml:space="preserve">Year, {course} - {branch} during the year </w:t>
+      </w:r>
+    </w:p>
+    <w:p>
+      <w:pPr>
+        <w:pStyle w:val="normal1"/>
+        <w:shd w:val="clear" w:fill="auto"/>
+        <w:spacing w:lineRule="auto" w:line="480"/>
+        <w:ind w:hanging="0" w:start="720"/>
+        <w:jc w:val="both"/>
+        <w:rPr>
+          <w:color w:val="202124"/>
+          <w:sz w:val="28"/>
+          <w:szCs w:val="28"/>
+          <w:highlight w:val="white"/>
+        </w:rPr>
+      </w:pPr>
+      <w:r>
+        <w:rPr>
+          <w:color w:val="202124"/>
+          <w:sz w:val="28"/>
+          <w:szCs w:val="28"/>
+          <w:highlight w:val="white"/>
+        </w:rPr>
+        <w:t>{academicYear}</w:t>
+      </w:r>
+      <w:r>
+        <w:rPr>
+          <w:b/>
+          <w:bCs/>
+          <w:color w:val="202124"/>
+          <w:sz w:val="28"/>
+          <w:szCs w:val="28"/>
+          <w:highlight w:val="white"/>
+        </w:rPr>
         <w:t>.</w:t>
       </w:r>
     </w:p>
@@ -315,6 +337,10 @@
         <w:pStyle w:val="normal1"/>
         <w:pageBreakBefore w:val="false"/>
         <w:shd w:val="clear" w:fill="auto"/>
+        <w:tabs>
+          <w:tab w:val="clear" w:pos="720"/>
+          <w:tab w:val="left" w:pos="8460" w:leader="none"/>
+        </w:tabs>
         <w:spacing w:lineRule="auto" w:line="480"/>
         <w:ind w:firstLine="180" w:start="630"/>
         <w:jc w:val="both"/>
@@ -337,7 +363,6 @@
           <w:sz w:val="28"/>
           <w:szCs w:val="28"/>
         </w:rPr>
-        <w:tab/>
         <w:t>This Certificate is issued to enable {himHer} to apply for {certificateFor}{#scholarshipType} ({scholarshipType}){/scholarshipType}.</w:t>
       </w:r>
     </w:p>
@@ -588,7 +613,7 @@
         </w:rPr>
         <w:t>Ph.No. 0452-2482240-42          Fax No: 0452-2483427            Email:</w:t>
       </w:r>
-      <w:hyperlink r:id="rId3">
+      <w:hyperlink r:id="rId2">
         <w:r>
           <w:rPr>
             <w:rStyle w:val="Style3"/>

</xml_diff>